<commit_message>
Updated projects and experience
</commit_message>
<xml_diff>
--- a/docs/Task 1.docx
+++ b/docs/Task 1.docx
@@ -48,7 +48,19 @@
           <w:rPr>
             <w:rStyle w:val="Hyperlink"/>
           </w:rPr>
-          <w:t>https://chatgpt.com/share/6a57996b-d138-83ee-9848-786743e2cd53</w:t>
+          <w:t>https://chatgpt.com/share/6a57996b-d138-83ee-9848-7867</w:t>
+        </w:r>
+        <w:r>
+          <w:rPr>
+            <w:rStyle w:val="Hyperlink"/>
+          </w:rPr>
+          <w:t>4</w:t>
+        </w:r>
+        <w:r>
+          <w:rPr>
+            <w:rStyle w:val="Hyperlink"/>
+          </w:rPr>
+          <w:t>3e2cd53</w:t>
         </w:r>
       </w:hyperlink>
     </w:p>
@@ -391,12 +403,26 @@
       </w:r>
     </w:p>
     <w:p>
-      <w:r>
+      <w:pPr>
+        <w:rPr>
+          <w:b/>
+          <w:bCs/>
+        </w:rPr>
+      </w:pPr>
+      <w:r>
+        <w:rPr>
+          <w:b/>
+          <w:bCs/>
+        </w:rPr>
         <w:t>Task 6:</w:t>
       </w:r>
     </w:p>
     <w:p>
       <w:r>
+        <w:rPr>
+          <w:b/>
+          <w:bCs/>
+        </w:rPr>
         <w:t>GPT prompt:</w:t>
       </w:r>
       <w:r>
@@ -408,6 +434,10 @@
     </w:p>
     <w:p>
       <w:r>
+        <w:rPr>
+          <w:b/>
+          <w:bCs/>
+        </w:rPr>
         <w:t>Cursor prompt:</w:t>
       </w:r>
       <w:r>
@@ -415,20 +445,228 @@
         <w:t xml:space="preserve">Read the structure and </w:t>
       </w:r>
       <w:r>
-        <w:t>Create scripts/seed-admin.ts that uses the Supabase service role key to create one Admin user in Supabase Auth (email + password from env vars) and inserts a linked row into the Profile table with role "Admin". Add an npm script seed:admin to run it with ts-node.</w:t>
-      </w:r>
-    </w:p>
-    <w:p>
-      <w:r>
+        <w:t xml:space="preserve">Create scripts/seed-admin.ts that </w:t>
+      </w:r>
+      <w:proofErr w:type="gramStart"/>
+      <w:r>
+        <w:t>uses</w:t>
+      </w:r>
+      <w:proofErr w:type="gramEnd"/>
+      <w:r>
+        <w:t xml:space="preserve"> the Supabase service role key to create one Admin user in Supabase Auth (email + password from env vars) and inserts a linked row into the Profile table with role "Admin". Add an npm script seed:admin to run it with ts-node.</w:t>
+      </w:r>
+    </w:p>
+    <w:p>
+      <w:r>
+        <w:rPr>
+          <w:b/>
+          <w:bCs/>
+        </w:rPr>
         <w:t>Cursor prompt:</w:t>
       </w:r>
       <w:r>
         <w:br/>
       </w:r>
       <w:r>
+        <w:t xml:space="preserve">Build a login page using </w:t>
+      </w:r>
+      <w:proofErr w:type="spellStart"/>
+      <w:r>
+        <w:t>Supabase</w:t>
+      </w:r>
+      <w:proofErr w:type="spellEnd"/>
+      <w:r>
+        <w:t xml:space="preserve"> Auth (email/password) with clean validation and error messages. After login, create a protected /dashboard layout with a sidebar (Dashboard, Contact Queries) that only Admin can access — redirect unauthenticated users to /login. Build the Dashboard page showing stats: total contacts, pending count, resolved/completed count, and the 5 most recent contacts.</w:t>
+      </w:r>
+    </w:p>
+    <w:p>
+      <w:r>
+        <w:rPr>
+          <w:b/>
+          <w:bCs/>
+        </w:rPr>
+        <w:t>Cursor prompt:</w:t>
+      </w:r>
+      <w:r>
         <w:br/>
       </w:r>
-    </w:p>
+      <w:r>
+        <w:t>Create a Contact Queries page listing all Contact rows in a table, with a status dropdown per row (Pending, Done, Completed, Resolved) that updates the row via a server action. Add a working Logout button in the sidebar.</w:t>
+      </w:r>
+    </w:p>
+    <w:p/>
+    <w:p>
+      <w:pPr>
+        <w:rPr>
+          <w:b/>
+          <w:bCs/>
+        </w:rPr>
+      </w:pPr>
+      <w:r>
+        <w:rPr>
+          <w:b/>
+          <w:bCs/>
+        </w:rPr>
+        <w:lastRenderedPageBreak/>
+        <w:t>Task 7:</w:t>
+      </w:r>
+    </w:p>
+    <w:p>
+      <w:r>
+        <w:rPr>
+          <w:b/>
+          <w:bCs/>
+        </w:rPr>
+        <w:t>Cursor prompt:</w:t>
+      </w:r>
+      <w:r>
+        <w:br/>
+      </w:r>
+      <w:r>
+        <w:t xml:space="preserve">Add Google reCAPTCHA v3 to the login page: load the script client-side, get a token on submit, and verify it server-side against the Google </w:t>
+      </w:r>
+      <w:proofErr w:type="spellStart"/>
+      <w:r>
+        <w:t>siteverify</w:t>
+      </w:r>
+      <w:proofErr w:type="spellEnd"/>
+      <w:r>
+        <w:t xml:space="preserve"> API before processing login</w:t>
+      </w:r>
+      <w:r>
+        <w:t>,</w:t>
+      </w:r>
+      <w:r>
+        <w:t xml:space="preserve"> reject with a friendly message if the score is too low. Then add IP-based login rate limiting using a </w:t>
+      </w:r>
+      <w:proofErr w:type="spellStart"/>
+      <w:r>
+        <w:t>LoginAttempt</w:t>
+      </w:r>
+      <w:proofErr w:type="spellEnd"/>
+      <w:r>
+        <w:t xml:space="preserve"> table (</w:t>
+      </w:r>
+      <w:proofErr w:type="spellStart"/>
+      <w:r>
+        <w:t>ip_address</w:t>
+      </w:r>
+      <w:proofErr w:type="spellEnd"/>
+      <w:r>
+        <w:t xml:space="preserve">, attempts, </w:t>
+      </w:r>
+      <w:proofErr w:type="spellStart"/>
+      <w:r>
+        <w:t>last_attempt_at</w:t>
+      </w:r>
+      <w:proofErr w:type="spellEnd"/>
+      <w:r>
+        <w:t xml:space="preserve">, </w:t>
+      </w:r>
+      <w:proofErr w:type="spellStart"/>
+      <w:r>
+        <w:t>blocked_until</w:t>
+      </w:r>
+      <w:proofErr w:type="spellEnd"/>
+      <w:r>
+        <w:t xml:space="preserve">): if the same IP fails more than 5 times, block further attempts for a cooldown period and show a clear "too many attempts, try again in X minutes" message. Make sure no internals (attempt counts, IPs) leak to the </w:t>
+      </w:r>
+      <w:proofErr w:type="gramStart"/>
+      <w:r>
+        <w:t>frontend</w:t>
+      </w:r>
+      <w:proofErr w:type="gramEnd"/>
+      <w:r>
+        <w:t>.</w:t>
+      </w:r>
+    </w:p>
+    <w:p>
+      <w:pPr>
+        <w:rPr>
+          <w:b/>
+          <w:bCs/>
+        </w:rPr>
+      </w:pPr>
+      <w:r>
+        <w:rPr>
+          <w:b/>
+          <w:bCs/>
+        </w:rPr>
+        <w:t xml:space="preserve">Task 8 </w:t>
+      </w:r>
+    </w:p>
+    <w:p>
+      <w:pPr>
+        <w:rPr>
+          <w:b/>
+          <w:bCs/>
+        </w:rPr>
+      </w:pPr>
+      <w:r>
+        <w:rPr>
+          <w:b/>
+          <w:bCs/>
+        </w:rPr>
+        <w:t>Cursor prompt:</w:t>
+      </w:r>
+    </w:p>
+    <w:p>
+      <w:r>
+        <w:t xml:space="preserve">Review the project for cleanup: remove </w:t>
+      </w:r>
+      <w:proofErr w:type="spellStart"/>
+      <w:proofErr w:type="gramStart"/>
+      <w:r>
+        <w:t>console.logs</w:t>
+      </w:r>
+      <w:proofErr w:type="spellEnd"/>
+      <w:proofErr w:type="gramEnd"/>
+      <w:r>
+        <w:t xml:space="preserve">, unused code, and confirm all env vars are referenced correctly. Then give me </w:t>
+      </w:r>
+      <w:proofErr w:type="gramStart"/>
+      <w:r>
+        <w:t>the git</w:t>
+      </w:r>
+      <w:proofErr w:type="gramEnd"/>
+      <w:r>
+        <w:t xml:space="preserve"> commands to create a production branch, merge main into it, and push</w:t>
+      </w:r>
+      <w:r>
+        <w:t>.</w:t>
+      </w:r>
+      <w:r>
+        <w:t xml:space="preserve"> </w:t>
+      </w:r>
+      <w:proofErr w:type="gramStart"/>
+      <w:r>
+        <w:t>S</w:t>
+      </w:r>
+      <w:r>
+        <w:t>o</w:t>
+      </w:r>
+      <w:proofErr w:type="gramEnd"/>
+      <w:r>
+        <w:t xml:space="preserve"> I can connect it </w:t>
+      </w:r>
+      <w:proofErr w:type="gramStart"/>
+      <w:r>
+        <w:t>as</w:t>
+      </w:r>
+      <w:proofErr w:type="gramEnd"/>
+      <w:r>
+        <w:t xml:space="preserve"> the </w:t>
+      </w:r>
+      <w:proofErr w:type="spellStart"/>
+      <w:r>
+        <w:t>Vercel</w:t>
+      </w:r>
+      <w:proofErr w:type="spellEnd"/>
+      <w:r>
+        <w:t xml:space="preserve"> production branch.</w:t>
+      </w:r>
+    </w:p>
+    <w:p/>
     <w:sectPr>
       <w:pgSz w:w="12240" w:h="15840"/>
       <w:pgMar w:top="1440" w:right="1440" w:bottom="1440" w:left="1440" w:header="720" w:footer="720" w:gutter="0"/>
@@ -1378,6 +1616,18 @@
       <w:shd w:val="clear" w:color="auto" w:fill="E1DFDD"/>
     </w:rPr>
   </w:style>
+  <w:style w:type="character" w:styleId="FollowedHyperlink">
+    <w:name w:val="FollowedHyperlink"/>
+    <w:basedOn w:val="DefaultParagraphFont"/>
+    <w:uiPriority w:val="99"/>
+    <w:semiHidden/>
+    <w:unhideWhenUsed/>
+    <w:rsid w:val="00DE6304"/>
+    <w:rPr>
+      <w:color w:val="96607D" w:themeColor="followedHyperlink"/>
+      <w:u w:val="single"/>
+    </w:rPr>
+  </w:style>
 </w:styles>
 </file>
 

</xml_diff>